<commit_message>
Interactive mapping of overture data in python
</commit_message>
<xml_diff>
--- a/docs/posts/overture-data-download/index.docx
+++ b/docs/posts/overture-data-download/index.docx
@@ -6134,36 +6134,6 @@
           <w:rStyle w:val="NormalTok"/>
         </w:rPr>
         <w:t xml:space="preserve">    .explore()</w:t>
-      </w:r>
-      <w:r>
-        <w:br/>
-      </w:r>
-      <w:r>
-        <w:rPr>
-          <w:rStyle w:val="NormalTok"/>
-        </w:rPr>
-        <w:t xml:space="preserve">    </w:t>
-      </w:r>
-      <w:r>
-        <w:br/>
-      </w:r>
-      <w:r>
-        <w:rPr>
-          <w:rStyle w:val="CommentTok"/>
-        </w:rPr>
-        <w:t xml:space="preserve"># </w:t>
-      </w:r>
-      <w:r>
-        <w:rPr>
-          <w:rStyle w:val="AlertTok"/>
-        </w:rPr>
-        <w:t xml:space="preserve">TODO</w:t>
-      </w:r>
-      <w:r>
-        <w:rPr>
-          <w:rStyle w:val="CommentTok"/>
-        </w:rPr>
-        <w:t xml:space="preserve">! This does NOT work yet.</w:t>
       </w:r>
     </w:p>
     <w:bookmarkEnd w:id="28"/>

</xml_diff>

<commit_message>
Set overture data interactive mapping basemap and zoom level
</commit_message>
<xml_diff>
--- a/docs/posts/overture-data-download/index.docx
+++ b/docs/posts/overture-data-download/index.docx
@@ -291,7 +291,7 @@
         <w:rPr>
           <w:rStyle w:val="StringTok"/>
         </w:rPr>
-        <w:t xml:space="preserve">"tmap"</w:t>
+        <w:t xml:space="preserve">"mapview"</w:t>
       </w:r>
       <w:r>
         <w:rPr>
@@ -449,7 +449,7 @@
         <w:rPr>
           <w:rStyle w:val="NormalTok"/>
         </w:rPr>
-        <w:t xml:space="preserve">(tmap)</w:t>
+        <w:t xml:space="preserve">(mapview)</w:t>
       </w:r>
       <w:r>
         <w:br/>
@@ -552,57 +552,6 @@
           <w:rStyle w:val="CommentTok"/>
         </w:rPr>
         <w:t xml:space="preserve"># avoiding scientific notation</w:t>
-      </w:r>
-      <w:r>
-        <w:br/>
-      </w:r>
-      <w:r>
-        <w:rPr>
-          <w:rStyle w:val="NormalTok"/>
-        </w:rPr>
-        <w:t xml:space="preserve">tmap</w:t>
-      </w:r>
-      <w:r>
-        <w:rPr>
-          <w:rStyle w:val="SpecialCharTok"/>
-        </w:rPr>
-        <w:t xml:space="preserve">::</w:t>
-      </w:r>
-      <w:r>
-        <w:rPr>
-          <w:rStyle w:val="FunctionTok"/>
-        </w:rPr>
-        <w:t xml:space="preserve">tmap_mode</w:t>
-      </w:r>
-      <w:r>
-        <w:rPr>
-          <w:rStyle w:val="NormalTok"/>
-        </w:rPr>
-        <w:t xml:space="preserve">(</w:t>
-      </w:r>
-      <w:r>
-        <w:rPr>
-          <w:rStyle w:val="AttributeTok"/>
-        </w:rPr>
-        <w:t xml:space="preserve">mode =</w:t>
-      </w:r>
-      <w:r>
-        <w:rPr>
-          <w:rStyle w:val="NormalTok"/>
-        </w:rPr>
-        <w:t xml:space="preserve"> </w:t>
-      </w:r>
-      <w:r>
-        <w:rPr>
-          <w:rStyle w:val="StringTok"/>
-        </w:rPr>
-        <w:t xml:space="preserve">"view"</w:t>
-      </w:r>
-      <w:r>
-        <w:rPr>
-          <w:rStyle w:val="NormalTok"/>
-        </w:rPr>
-        <w:t xml:space="preserve">)</w:t>
       </w:r>
     </w:p>
     <w:p>
@@ -5550,7 +5499,7 @@
         <w:rPr>
           <w:rStyle w:val="CommentTok"/>
         </w:rPr>
-        <w:t xml:space="preserve"># Simple quick visualization using tmap</w:t>
+        <w:t xml:space="preserve"># Simple quick visualization using mapview</w:t>
       </w:r>
       <w:r>
         <w:br/>
@@ -5859,7 +5808,7 @@
         <w:rPr>
           <w:rStyle w:val="NormalTok"/>
         </w:rPr>
-        <w:t xml:space="preserve">  tmap</w:t>
+        <w:t xml:space="preserve">  mapview</w:t>
       </w:r>
       <w:r>
         <w:rPr>
@@ -5871,13 +5820,37 @@
         <w:rPr>
           <w:rStyle w:val="FunctionTok"/>
         </w:rPr>
-        <w:t xml:space="preserve">qtm</w:t>
-      </w:r>
-      <w:r>
-        <w:rPr>
-          <w:rStyle w:val="NormalTok"/>
-        </w:rPr>
-        <w:t xml:space="preserve">()</w:t>
+        <w:t xml:space="preserve">mapview</w:t>
+      </w:r>
+      <w:r>
+        <w:rPr>
+          <w:rStyle w:val="NormalTok"/>
+        </w:rPr>
+        <w:t xml:space="preserve">(</w:t>
+      </w:r>
+      <w:r>
+        <w:rPr>
+          <w:rStyle w:val="AttributeTok"/>
+        </w:rPr>
+        <w:t xml:space="preserve">map.types =</w:t>
+      </w:r>
+      <w:r>
+        <w:rPr>
+          <w:rStyle w:val="NormalTok"/>
+        </w:rPr>
+        <w:t xml:space="preserve"> </w:t>
+      </w:r>
+      <w:r>
+        <w:rPr>
+          <w:rStyle w:val="StringTok"/>
+        </w:rPr>
+        <w:t xml:space="preserve">"CartoDB.Voyager"</w:t>
+      </w:r>
+      <w:r>
+        <w:rPr>
+          <w:rStyle w:val="NormalTok"/>
+        </w:rPr>
+        <w:t xml:space="preserve">)</w:t>
       </w:r>
     </w:p>
     <w:p>
@@ -6133,7 +6106,43 @@
         <w:rPr>
           <w:rStyle w:val="NormalTok"/>
         </w:rPr>
-        <w:t xml:space="preserve">    .explore()</w:t>
+        <w:t xml:space="preserve">    .explore(tiles</w:t>
+      </w:r>
+      <w:r>
+        <w:rPr>
+          <w:rStyle w:val="OperatorTok"/>
+        </w:rPr>
+        <w:t xml:space="preserve">=</w:t>
+      </w:r>
+      <w:r>
+        <w:rPr>
+          <w:rStyle w:val="StringTok"/>
+        </w:rPr>
+        <w:t xml:space="preserve">"CartoDB.Voyager"</w:t>
+      </w:r>
+      <w:r>
+        <w:rPr>
+          <w:rStyle w:val="NormalTok"/>
+        </w:rPr>
+        <w:t xml:space="preserve">, zoom_start</w:t>
+      </w:r>
+      <w:r>
+        <w:rPr>
+          <w:rStyle w:val="OperatorTok"/>
+        </w:rPr>
+        <w:t xml:space="preserve">=</w:t>
+      </w:r>
+      <w:r>
+        <w:rPr>
+          <w:rStyle w:val="DecValTok"/>
+        </w:rPr>
+        <w:t xml:space="preserve">9</w:t>
+      </w:r>
+      <w:r>
+        <w:rPr>
+          <w:rStyle w:val="NormalTok"/>
+        </w:rPr>
+        <w:t xml:space="preserve">)</w:t>
       </w:r>
     </w:p>
     <w:bookmarkEnd w:id="28"/>

</xml_diff>

<commit_message>
Disable legend in overture mapping
</commit_message>
<xml_diff>
--- a/docs/posts/overture-data-download/index.docx
+++ b/docs/posts/overture-data-download/index.docx
@@ -496,63 +496,6 @@
         </w:rPr>
         <w:t xml:space="preserve">(arrow)</w:t>
       </w:r>
-      <w:r>
-        <w:br/>
-      </w:r>
-      <w:r>
-        <w:br/>
-      </w:r>
-      <w:r>
-        <w:rPr>
-          <w:rStyle w:val="CommentTok"/>
-        </w:rPr>
-        <w:t xml:space="preserve"># Set global options</w:t>
-      </w:r>
-      <w:r>
-        <w:br/>
-      </w:r>
-      <w:r>
-        <w:rPr>
-          <w:rStyle w:val="FunctionTok"/>
-        </w:rPr>
-        <w:t xml:space="preserve">options</w:t>
-      </w:r>
-      <w:r>
-        <w:rPr>
-          <w:rStyle w:val="NormalTok"/>
-        </w:rPr>
-        <w:t xml:space="preserve">(</w:t>
-      </w:r>
-      <w:r>
-        <w:rPr>
-          <w:rStyle w:val="AttributeTok"/>
-        </w:rPr>
-        <w:t xml:space="preserve">scipen =</w:t>
-      </w:r>
-      <w:r>
-        <w:rPr>
-          <w:rStyle w:val="NormalTok"/>
-        </w:rPr>
-        <w:t xml:space="preserve"> </w:t>
-      </w:r>
-      <w:r>
-        <w:rPr>
-          <w:rStyle w:val="DecValTok"/>
-        </w:rPr>
-        <w:t xml:space="preserve">999</w:t>
-      </w:r>
-      <w:r>
-        <w:rPr>
-          <w:rStyle w:val="NormalTok"/>
-        </w:rPr>
-        <w:t xml:space="preserve">) </w:t>
-      </w:r>
-      <w:r>
-        <w:rPr>
-          <w:rStyle w:val="CommentTok"/>
-        </w:rPr>
-        <w:t xml:space="preserve"># avoiding scientific notation</w:t>
-      </w:r>
     </w:p>
     <w:p>
       <w:pPr>
@@ -5845,6 +5788,30 @@
           <w:rStyle w:val="StringTok"/>
         </w:rPr>
         <w:t xml:space="preserve">"CartoDB.Voyager"</w:t>
+      </w:r>
+      <w:r>
+        <w:rPr>
+          <w:rStyle w:val="NormalTok"/>
+        </w:rPr>
+        <w:t xml:space="preserve">, </w:t>
+      </w:r>
+      <w:r>
+        <w:rPr>
+          <w:rStyle w:val="AttributeTok"/>
+        </w:rPr>
+        <w:t xml:space="preserve">legend =</w:t>
+      </w:r>
+      <w:r>
+        <w:rPr>
+          <w:rStyle w:val="NormalTok"/>
+        </w:rPr>
+        <w:t xml:space="preserve"> </w:t>
+      </w:r>
+      <w:r>
+        <w:rPr>
+          <w:rStyle w:val="ConstantTok"/>
+        </w:rPr>
+        <w:t xml:space="preserve">FALSE</w:t>
       </w:r>
       <w:r>
         <w:rPr>

</xml_diff>

<commit_message>
cleanup: python line breaks
</commit_message>
<xml_diff>
--- a/docs/posts/overture-data-download/index.docx
+++ b/docs/posts/overture-data-download/index.docx
@@ -4349,16 +4349,7 @@
         <w:rPr>
           <w:rStyle w:val="NormalTok"/>
         </w:rPr>
-        <w:t xml:space="preserve"> (</w:t>
-      </w:r>
-      <w:r>
-        <w:br/>
-      </w:r>
-      <w:r>
-        <w:rPr>
-          <w:rStyle w:val="NormalTok"/>
-        </w:rPr>
-        <w:t xml:space="preserve">    gpd.read_file(</w:t>
+        <w:t xml:space="preserve"> gpd.read_file(</w:t>
       </w:r>
       <w:r>
         <w:rPr>
@@ -4370,7 +4361,13 @@
         <w:rPr>
           <w:rStyle w:val="NormalTok"/>
         </w:rPr>
-        <w:t xml:space="preserve">)</w:t>
+        <w:t xml:space="preserve">) </w:t>
+      </w:r>
+      <w:r>
+        <w:rPr>
+          <w:rStyle w:val="OperatorTok"/>
+        </w:rPr>
+        <w:t xml:space="preserve">\</w:t>
       </w:r>
       <w:r>
         <w:br/>
@@ -4386,15 +4383,6 @@
           <w:rStyle w:val="StringTok"/>
         </w:rPr>
         <w:t xml:space="preserve">"EPSG:4326"</w:t>
-      </w:r>
-      <w:r>
-        <w:rPr>
-          <w:rStyle w:val="NormalTok"/>
-        </w:rPr>
-        <w:t xml:space="preserve">)</w:t>
-      </w:r>
-      <w:r>
-        <w:br/>
       </w:r>
       <w:r>
         <w:rPr>

</xml_diff>